<commit_message>
Harden portfolio metadata and verified claims
</commit_message>
<xml_diff>
--- a/resume-src/Braeden_Keena_Resume_deployed_source.docx
+++ b/resume-src/Braeden_Keena_Resume_deployed_source.docx
@@ -31,7 +31,7 @@
           <w:i w:val="0"/>
           <w:sz w:val="22"/>
         </w:rPr>
-        <w:t>Self-Taught Builder · Production Scrapers · Data Pipelines &amp; Automation</w:t>
+        <w:t>Data Engineer · Recurring Pipelines · Data Integrity &amp; Failure Detection</w:t>
       </w:r>
     </w:p>
     <w:p>
@@ -47,7 +47,9 @@
           <w:i w:val="0"/>
           <w:sz w:val="19"/>
         </w:rPr>
-        <w:t>Overland Park, KS 66213  ·  Braeden@thekeenas.com  ·  (303) 507-8626  ·  nacup.us  ·  findstorage.pages.dev</w:t>
+        <w:t>Overland Park, KS 66213  ·  Braeden@thekeenas.com  ·  (303) 507-8626</w:t>
+        <w:br/>
+        <w:t>braedenkeena.pages.dev  ·  github.com/itshumpf  ·  gascout.pages.dev  ·  nacup.us</w:t>
       </w:r>
     </w:p>
     <w:p>
@@ -62,7 +64,7 @@
           <w:i w:val="0"/>
           <w:sz w:val="21"/>
         </w:rPr>
-        <w:t>Self-taught technical builder — I ship production scrapers, data pipelines, and automation. Three deployed, live web applications in the past 14 months, built end to end: API reverse-engineering, data pipelines, front-end, SEO, and daily automation. Backed by a decade of hands-on operations leadership managing teams of up to 100 people. I learn whatever a problem requires, then build the thing.</w:t>
+        <w:t>I build data collection that keeps working, and I specialize in the failure that looks like success — a pipeline reporting a clean run while returning nothing. Every figure I publish is emitted by a script that refuses to write a null. Backed by front-line operations leadership, including founding and running my own business, managing teams of up to 100 people.</w:t>
       </w:r>
     </w:p>
     <w:p>
@@ -113,7 +115,7 @@
           <w:i/>
           <w:sz w:val="20"/>
         </w:rPr>
-        <w:t>2026 · Deployed / Live · Firmware / DSP</w:t>
+        <w:t>54 days, from zero · Firmware / DSP</w:t>
       </w:r>
     </w:p>
     <w:p>
@@ -142,7 +144,7 @@
           <w:i w:val="0"/>
           <w:sz w:val="21"/>
         </w:rPr>
-        <w:t>Deployed and running 24/7 as the live, in-production home-security system for my own apartment — not a benchtop experiment. Built by applying the scientific method to a hard RF problem: hypothesized that a radio’s crystal-oscillator imperfections form a hardware fingerprint that survives MAC-address randomization, then proved through controlled experiments that device identity can be recovered from clock behavior rather than spoofable network identifiers.</w:t>
+        <w:t>Fifty-four days from not knowing what an ESP32 was to a closed scientific loop — instrument, method, answer, next hypothesis. Built on a repurposed Meshtastic node and a beginner kit off Amazon: five boards, C / ESP-IDF firmware, and a Python DSP chain (RANSAC phase-slope fits, Kalman drift tracking, Mahalanobis discrimination).</w:t>
       </w:r>
     </w:p>
     <w:p>
@@ -171,7 +173,7 @@
           <w:i w:val="0"/>
           <w:sz w:val="21"/>
         </w:rPr>
-        <w:t>Built the full stack solo — ESP32 firmware (C / ESP-IDF) plus a Python DSP pipeline (RANSAC phase-slope fits → 1D Kalman drift tracking → Mahalanobis discrimination against per-source Gaussian models) — reaching 12.7σ and 10.4σ cross-manufacturer device separation on a 6/6 holdout, and 99.7% holdout accuracy across 7,497 windows on a single receiver (95.7% across 14,234 windows spanning two receivers), over a 2.36-million-frame dataset.</w:t>
+        <w:t>Restarted the project in July specifically to test it rather than defend it. Two months and twenty-nine hypotheses carried to a verdict, thirteen of them my own working results, each retired by a control I built to permit that outcome.</w:t>
       </w:r>
     </w:p>
     <w:p>
@@ -200,7 +202,311 @@
           <w:i w:val="0"/>
           <w:sz w:val="21"/>
         </w:rPr>
-        <w:t>Diagnosed thermal oscillator drift as the accuracy-limiting problem and engineered a novel reference-beacon drift-correction technique that cancels receiver-side drift and more than doubled device separation — turning an unstable measurement into a reliable fingerprint.</w:t>
+        <w:t>The separation was real. What it was separating wasn’t. Two boards four feet apart read 0.2σ; one moved between rooms read 19.6σ — rooms, not radios. Then 69.5 million frames across eight paired overnight captures, scored against decision rules frozen before the run, showed it was neither: the transmitter, the receiver, and the path between them, measured as one object.</w:t>
+      </w:r>
+    </w:p>
+    <w:p>
+      <w:pPr>
+        <w:widowControl w:val="0"/>
+        <w:tabs>
+          <w:tab w:pos="340" w:val="left"/>
+        </w:tabs>
+        <w:spacing w:before="0" w:after="40" w:line="240" w:lineRule="auto"/>
+        <w:ind w:left="340" w:hanging="200"/>
+      </w:pPr>
+      <w:r>
+        <w:rPr>
+          <w:rFonts w:ascii="Carlito" w:hAnsi="Carlito" w:cs="Carlito" w:eastAsia="Carlito"/>
+          <w:b w:val="0"/>
+          <w:i w:val="0"/>
+          <w:sz w:val="21"/>
+        </w:rPr>
+        <w:t>•</w:t>
+        <w:tab/>
+      </w:r>
+      <w:r>
+        <w:rPr>
+          <w:rFonts w:ascii="Carlito" w:hAnsi="Carlito" w:cs="Carlito" w:eastAsia="Carlito"/>
+          <w:b w:val="0"/>
+          <w:i w:val="0"/>
+          <w:sz w:val="21"/>
+        </w:rPr>
+        <w:t>It still identifies three co-located transmitters at 95.8% blind accuracy — it just isn’t a property of the radio alone. Every threshold written to disk and dated before the test that used it, results that went against me published beside the ones that didn’t. V2: find the link, measure it, find out whether it can be tracked. braedenkeena.pages.dev</w:t>
+      </w:r>
+    </w:p>
+    <w:p>
+      <w:pPr>
+        <w:widowControl w:val="0"/>
+        <w:tabs>
+          <w:tab w:pos="9004" w:val="right"/>
+        </w:tabs>
+        <w:spacing w:before="140" w:after="0" w:line="240" w:lineRule="auto"/>
+      </w:pPr>
+      <w:r>
+        <w:rPr>
+          <w:rFonts w:ascii="Carlito" w:hAnsi="Carlito" w:cs="Carlito" w:eastAsia="Carlito"/>
+          <w:b/>
+          <w:i w:val="0"/>
+          <w:sz w:val="22"/>
+        </w:rPr>
+        <w:t>findstorage.pages.dev — Self-Storage Price Tracker</w:t>
+      </w:r>
+      <w:r>
+        <w:rPr>
+          <w:rFonts w:ascii="Carlito" w:hAnsi="Carlito" w:cs="Carlito" w:eastAsia="Carlito"/>
+          <w:b/>
+          <w:i w:val="0"/>
+          <w:sz w:val="22"/>
+        </w:rPr>
+        <w:tab/>
+      </w:r>
+      <w:r>
+        <w:rPr>
+          <w:rFonts w:ascii="Carlito" w:hAnsi="Carlito" w:cs="Carlito" w:eastAsia="Carlito"/>
+          <w:b w:val="0"/>
+          <w:i/>
+          <w:sz w:val="20"/>
+        </w:rPr>
+        <w:t>2025 – 2026 · Founder / Developer · Sunset by choice</w:t>
+      </w:r>
+    </w:p>
+    <w:p>
+      <w:pPr>
+        <w:widowControl w:val="0"/>
+        <w:tabs>
+          <w:tab w:pos="340" w:val="left"/>
+        </w:tabs>
+        <w:spacing w:before="28" w:after="40" w:line="240" w:lineRule="auto"/>
+        <w:ind w:left="340" w:hanging="200"/>
+      </w:pPr>
+      <w:r>
+        <w:rPr>
+          <w:rFonts w:ascii="Carlito" w:hAnsi="Carlito" w:cs="Carlito" w:eastAsia="Carlito"/>
+          <w:b w:val="0"/>
+          <w:i w:val="0"/>
+          <w:sz w:val="21"/>
+        </w:rPr>
+        <w:t>•</w:t>
+        <w:tab/>
+      </w:r>
+      <w:r>
+        <w:rPr>
+          <w:rFonts w:ascii="Carlito" w:hAnsi="Carlito" w:cs="Carlito" w:eastAsia="Carlito"/>
+          <w:b w:val="0"/>
+          <w:i w:val="0"/>
+          <w:sz w:val="21"/>
+        </w:rPr>
+        <w:t>Daily national advertised-price tracker: 4,664 stores across 41 states plus DC and Puerto Rico, 46 consecutive daily snapshots with zero gaps, 396,402 price changes and 148,870 promotion changes logged. 7-pass discovery scraper with safety rails that abort a publish if the store count drops below a floor or swings &gt;10% run-over-run — an operator merger added ~1,100 stores overnight and the pipeline absorbed it with no manual intervention.</w:t>
+      </w:r>
+    </w:p>
+    <w:p>
+      <w:pPr>
+        <w:widowControl w:val="0"/>
+        <w:tabs>
+          <w:tab w:pos="340" w:val="left"/>
+        </w:tabs>
+        <w:spacing w:before="0" w:after="40" w:line="240" w:lineRule="auto"/>
+        <w:ind w:left="340" w:hanging="200"/>
+      </w:pPr>
+      <w:r>
+        <w:rPr>
+          <w:rFonts w:ascii="Carlito" w:hAnsi="Carlito" w:cs="Carlito" w:eastAsia="Carlito"/>
+          <w:b w:val="0"/>
+          <w:i w:val="0"/>
+          <w:sz w:val="21"/>
+        </w:rPr>
+        <w:t>•</w:t>
+        <w:tab/>
+      </w:r>
+      <w:r>
+        <w:rPr>
+          <w:rFonts w:ascii="Carlito" w:hAnsi="Carlito" w:cs="Carlito" w:eastAsia="Carlito"/>
+          <w:b w:val="0"/>
+          <w:i w:val="0"/>
+          <w:sz w:val="21"/>
+        </w:rPr>
+        <w:t>Shut the project down on 25 August 2026 after re-reading the source’s terms of use, and published why rather than stopping quietly — killing a six-week analysis that a lawyer had already cleared, because the data underneath it was collected under terms I had not re-checked.</w:t>
+      </w:r>
+    </w:p>
+    <w:p>
+      <w:pPr>
+        <w:widowControl w:val="0"/>
+        <w:tabs>
+          <w:tab w:pos="340" w:val="left"/>
+        </w:tabs>
+        <w:spacing w:before="0" w:after="40" w:line="240" w:lineRule="auto"/>
+        <w:ind w:left="340" w:hanging="200"/>
+      </w:pPr>
+      <w:r>
+        <w:rPr>
+          <w:rFonts w:ascii="Carlito" w:hAnsi="Carlito" w:cs="Carlito" w:eastAsia="Carlito"/>
+          <w:b w:val="0"/>
+          <w:i w:val="0"/>
+          <w:sz w:val="21"/>
+        </w:rPr>
+        <w:t>•</w:t>
+        <w:tab/>
+      </w:r>
+      <w:r>
+        <w:rPr>
+          <w:rFonts w:ascii="Carlito" w:hAnsi="Carlito" w:cs="Carlito" w:eastAsia="Carlito"/>
+          <w:b w:val="0"/>
+          <w:i w:val="0"/>
+          <w:sz w:val="21"/>
+        </w:rPr>
+        <w:t>Found and fixed four separate errors in my own published analysis before shutting down, including a coverage figure wrong by 5.6× that no script had ever recomputed. Every published number now traces to a named command.</w:t>
+      </w:r>
+    </w:p>
+    <w:p>
+      <w:pPr>
+        <w:widowControl w:val="0"/>
+        <w:tabs>
+          <w:tab w:pos="9004" w:val="right"/>
+        </w:tabs>
+        <w:spacing w:before="140" w:after="0" w:line="240" w:lineRule="auto"/>
+      </w:pPr>
+      <w:r>
+        <w:rPr>
+          <w:rFonts w:ascii="Carlito" w:hAnsi="Carlito" w:cs="Carlito" w:eastAsia="Carlito"/>
+          <w:b/>
+          <w:i w:val="0"/>
+          <w:sz w:val="22"/>
+        </w:rPr>
+        <w:t>Public-Records Extraction — GAScout · easyIce · KcPermits</w:t>
+      </w:r>
+      <w:r>
+        <w:rPr>
+          <w:rFonts w:ascii="Carlito" w:hAnsi="Carlito" w:cs="Carlito" w:eastAsia="Carlito"/>
+          <w:b/>
+          <w:i w:val="0"/>
+          <w:sz w:val="22"/>
+        </w:rPr>
+        <w:tab/>
+      </w:r>
+      <w:r>
+        <w:rPr>
+          <w:rFonts w:ascii="Carlito" w:hAnsi="Carlito" w:cs="Carlito" w:eastAsia="Carlito"/>
+          <w:b w:val="0"/>
+          <w:i/>
+          <w:sz w:val="20"/>
+        </w:rPr>
+        <w:t>2025 – 2026 · Solo-built</w:t>
+      </w:r>
+    </w:p>
+    <w:p>
+      <w:pPr>
+        <w:widowControl w:val="0"/>
+        <w:tabs>
+          <w:tab w:pos="340" w:val="left"/>
+        </w:tabs>
+        <w:spacing w:before="28" w:after="40" w:line="240" w:lineRule="auto"/>
+        <w:ind w:left="340" w:hanging="200"/>
+      </w:pPr>
+      <w:r>
+        <w:rPr>
+          <w:rFonts w:ascii="Carlito" w:hAnsi="Carlito" w:cs="Carlito" w:eastAsia="Carlito"/>
+          <w:b w:val="0"/>
+          <w:i w:val="0"/>
+          <w:sz w:val="21"/>
+        </w:rPr>
+        <w:t>•</w:t>
+        <w:tab/>
+      </w:r>
+      <w:r>
+        <w:rPr>
+          <w:rFonts w:ascii="Carlito" w:hAnsi="Carlito" w:cs="Carlito" w:eastAsia="Carlito"/>
+          <w:b w:val="0"/>
+          <w:i w:val="0"/>
+          <w:sz w:val="21"/>
+        </w:rPr>
+        <w:t>Turn government systems never designed to be read programmatically into structured, deduplicated, ranked datasets. GAScout (gascout.pages.dev): $152.34M in delinquent taxes and 451,798 records across four live Georgia counties in four source formats — a 9,915-page mainframe PDF, a weekly XLSX roll, a monthly PDF, and a scanned PDF read by OCR — normalized to one schema.</w:t>
+      </w:r>
+    </w:p>
+    <w:p>
+      <w:pPr>
+        <w:widowControl w:val="0"/>
+        <w:tabs>
+          <w:tab w:pos="340" w:val="left"/>
+        </w:tabs>
+        <w:spacing w:before="0" w:after="40" w:line="240" w:lineRule="auto"/>
+        <w:ind w:left="340" w:hanging="200"/>
+      </w:pPr>
+      <w:r>
+        <w:rPr>
+          <w:rFonts w:ascii="Carlito" w:hAnsi="Carlito" w:cs="Carlito" w:eastAsia="Carlito"/>
+          <w:b w:val="0"/>
+          <w:i w:val="0"/>
+          <w:sz w:val="21"/>
+        </w:rPr>
+        <w:t>•</w:t>
+        <w:tab/>
+      </w:r>
+      <w:r>
+        <w:rPr>
+          <w:rFonts w:ascii="Carlito" w:hAnsi="Carlito" w:cs="Carlito" w:eastAsia="Carlito"/>
+          <w:b w:val="0"/>
+          <w:i w:val="0"/>
+          <w:sz w:val="21"/>
+        </w:rPr>
+        <w:t>easyIce converts county health-inspection records into a recency-scored call list across five jurisdiction adapters and three source shapes (Socrata JSON API, server-rendered HTML with sequential IDs, Tyler portals); 387 tests, none touching the network. Every run publishes a coverage report that declares its own degradation first — a partial run cannot be mistaken for a complete one.</w:t>
+      </w:r>
+    </w:p>
+    <w:p>
+      <w:pPr>
+        <w:widowControl w:val="0"/>
+        <w:tabs>
+          <w:tab w:pos="340" w:val="left"/>
+        </w:tabs>
+        <w:spacing w:before="0" w:after="40" w:line="240" w:lineRule="auto"/>
+        <w:ind w:left="340" w:hanging="200"/>
+      </w:pPr>
+      <w:r>
+        <w:rPr>
+          <w:rFonts w:ascii="Carlito" w:hAnsi="Carlito" w:cs="Carlito" w:eastAsia="Carlito"/>
+          <w:b w:val="0"/>
+          <w:i w:val="0"/>
+          <w:sz w:val="21"/>
+        </w:rPr>
+        <w:t>•</w:t>
+        <w:tab/>
+      </w:r>
+      <w:r>
+        <w:rPr>
+          <w:rFonts w:ascii="Carlito" w:hAnsi="Carlito" w:cs="Carlito" w:eastAsia="Carlito"/>
+          <w:b w:val="0"/>
+          <w:i w:val="0"/>
+          <w:sz w:val="21"/>
+        </w:rPr>
+        <w:t>KcPermits consolidates 57,032 records from 21 municipal and county feeds into 30,587 resolved locations. Reverse-engineered Tyler EnerGov’s four undocumented tenant headers across four city portals — tenant IDs differ between identical vendor installs — then measured two silent failures: a 10,000-result ceiling that returns HTTP 200 with no warning, and a date filter ignored server-side, where a 90-day window returned the same 124,214 rows as no window at all.</w:t>
+      </w:r>
+    </w:p>
+    <w:p>
+      <w:pPr>
+        <w:widowControl w:val="0"/>
+        <w:tabs>
+          <w:tab w:pos="340" w:val="left"/>
+        </w:tabs>
+        <w:spacing w:before="0" w:after="40" w:line="240" w:lineRule="auto"/>
+        <w:ind w:left="340" w:hanging="200"/>
+      </w:pPr>
+      <w:r>
+        <w:rPr>
+          <w:rFonts w:ascii="Carlito" w:hAnsi="Carlito" w:cs="Carlito" w:eastAsia="Carlito"/>
+          <w:b w:val="0"/>
+          <w:i w:val="0"/>
+          <w:sz w:val="21"/>
+        </w:rPr>
+        <w:t>•</w:t>
+        <w:tab/>
+      </w:r>
+      <w:r>
+        <w:rPr>
+          <w:rFonts w:ascii="Carlito" w:hAnsi="Carlito" w:cs="Carlito" w:eastAsia="Carlito"/>
+          <w:b w:val="0"/>
+          <w:i w:val="0"/>
+          <w:sz w:val="21"/>
+        </w:rPr>
+        <w:t>The deliverable is built to refuse its own output: 37 source records consolidate to 10 projects and 4 prospects, each published with the limitation requiring resolution before action. A written spec constrains the renderer to fields that exist in a record, so the presentation layer cannot compose a claim the data does not carry.</w:t>
       </w:r>
     </w:p>
     <w:p>
@@ -323,318 +629,7 @@
           <w:i w:val="0"/>
           <w:sz w:val="21"/>
         </w:rPr>
-        <w:t>Programmatically generated 80+ static SEO pages with JSON-LD structured data, sitemap, and Search Console integration; live-score polling with caching and fallback states.</w:t>
-      </w:r>
-    </w:p>
-    <w:p>
-      <w:pPr>
-        <w:widowControl w:val="0"/>
-        <w:tabs>
-          <w:tab w:pos="340" w:val="left"/>
-        </w:tabs>
-        <w:spacing w:before="0" w:after="40" w:line="240" w:lineRule="auto"/>
-        <w:ind w:left="340" w:hanging="200"/>
-      </w:pPr>
-      <w:r>
-        <w:rPr>
-          <w:rFonts w:ascii="Carlito" w:hAnsi="Carlito" w:cs="Carlito" w:eastAsia="Carlito"/>
-          <w:b w:val="0"/>
-          <w:i w:val="0"/>
-          <w:sz w:val="21"/>
-        </w:rPr>
-        <w:t>•</w:t>
-        <w:tab/>
-      </w:r>
-      <w:r>
-        <w:rPr>
-          <w:rFonts w:ascii="Carlito" w:hAnsi="Carlito" w:cs="Carlito" w:eastAsia="Carlito"/>
-          <w:b w:val="0"/>
-          <w:i w:val="0"/>
-          <w:sz w:val="21"/>
-        </w:rPr>
-        <w:t>Stack: Python, vanilla JavaScript, Leaflet.js, Cloudflare Pages, GitHub CI/CD.</w:t>
-      </w:r>
-    </w:p>
-    <w:p>
-      <w:pPr>
-        <w:widowControl w:val="0"/>
-        <w:tabs>
-          <w:tab w:pos="9004" w:val="right"/>
-        </w:tabs>
-        <w:spacing w:before="140" w:after="0" w:line="240" w:lineRule="auto"/>
-      </w:pPr>
-      <w:r>
-        <w:rPr>
-          <w:rFonts w:ascii="Carlito" w:hAnsi="Carlito" w:cs="Carlito" w:eastAsia="Carlito"/>
-          <w:b/>
-          <w:i w:val="0"/>
-          <w:sz w:val="22"/>
-        </w:rPr>
-        <w:t>findstorage.pages.dev — Nationwide Self-Storage Directory</w:t>
-      </w:r>
-      <w:r>
-        <w:rPr>
-          <w:rFonts w:ascii="Carlito" w:hAnsi="Carlito" w:cs="Carlito" w:eastAsia="Carlito"/>
-          <w:b/>
-          <w:i w:val="0"/>
-          <w:sz w:val="22"/>
-        </w:rPr>
-        <w:tab/>
-      </w:r>
-      <w:r>
-        <w:rPr>
-          <w:rFonts w:ascii="Carlito" w:hAnsi="Carlito" w:cs="Carlito" w:eastAsia="Carlito"/>
-          <w:b w:val="0"/>
-          <w:i/>
-          <w:sz w:val="20"/>
-        </w:rPr>
-        <w:t>2025 · Founder / Developer</w:t>
-      </w:r>
-    </w:p>
-    <w:p>
-      <w:pPr>
-        <w:widowControl w:val="0"/>
-        <w:tabs>
-          <w:tab w:pos="340" w:val="left"/>
-        </w:tabs>
-        <w:spacing w:before="28" w:after="40" w:line="240" w:lineRule="auto"/>
-        <w:ind w:left="340" w:hanging="200"/>
-      </w:pPr>
-      <w:r>
-        <w:rPr>
-          <w:rFonts w:ascii="Carlito" w:hAnsi="Carlito" w:cs="Carlito" w:eastAsia="Carlito"/>
-          <w:b w:val="0"/>
-          <w:i w:val="0"/>
-          <w:sz w:val="21"/>
-        </w:rPr>
-        <w:t>•</w:t>
-        <w:tab/>
-      </w:r>
-      <w:r>
-        <w:rPr>
-          <w:rFonts w:ascii="Carlito" w:hAnsi="Carlito" w:cs="Carlito" w:eastAsia="Carlito"/>
-          <w:b w:val="0"/>
-          <w:i w:val="0"/>
-          <w:sz w:val="21"/>
-        </w:rPr>
-        <w:t>Daily self-scraping national self-storage pricing directory and market-research tool tracking ~4,600 stores / ~43,900 units — a 7-pass discovery scraper with safety rails that aborts a publish if the store count drops below a floor or swings &gt;10% run-over-run.</w:t>
-      </w:r>
-    </w:p>
-    <w:p>
-      <w:pPr>
-        <w:widowControl w:val="0"/>
-        <w:tabs>
-          <w:tab w:pos="340" w:val="left"/>
-        </w:tabs>
-        <w:spacing w:before="0" w:after="40" w:line="240" w:lineRule="auto"/>
-        <w:ind w:left="340" w:hanging="200"/>
-      </w:pPr>
-      <w:r>
-        <w:rPr>
-          <w:rFonts w:ascii="Carlito" w:hAnsi="Carlito" w:cs="Carlito" w:eastAsia="Carlito"/>
-          <w:b w:val="0"/>
-          <w:i w:val="0"/>
-          <w:sz w:val="21"/>
-        </w:rPr>
-        <w:t>•</w:t>
-        <w:tab/>
-      </w:r>
-      <w:r>
-        <w:rPr>
-          <w:rFonts w:ascii="Carlito" w:hAnsi="Carlito" w:cs="Carlito" w:eastAsia="Carlito"/>
-          <w:b w:val="0"/>
-          <w:i w:val="0"/>
-          <w:sz w:val="21"/>
-        </w:rPr>
-        <w:t>Nationwide ZIP3 market analysis with matched-pairs attribute pricing (isolated a ~18–22% climate-control premium via same-store/same-size comparison), a “renter leverage” score, and per-store price-history drill-down.</w:t>
-      </w:r>
-    </w:p>
-    <w:p>
-      <w:pPr>
-        <w:widowControl w:val="0"/>
-        <w:tabs>
-          <w:tab w:pos="340" w:val="left"/>
-        </w:tabs>
-        <w:spacing w:before="0" w:after="40" w:line="240" w:lineRule="auto"/>
-        <w:ind w:left="340" w:hanging="200"/>
-      </w:pPr>
-      <w:r>
-        <w:rPr>
-          <w:rFonts w:ascii="Carlito" w:hAnsi="Carlito" w:cs="Carlito" w:eastAsia="Carlito"/>
-          <w:b w:val="0"/>
-          <w:i w:val="0"/>
-          <w:sz w:val="21"/>
-        </w:rPr>
-        <w:t>•</w:t>
-        <w:tab/>
-      </w:r>
-      <w:r>
-        <w:rPr>
-          <w:rFonts w:ascii="Carlito" w:hAnsi="Carlito" w:cs="Carlito" w:eastAsia="Carlito"/>
-          <w:b w:val="0"/>
-          <w:i w:val="0"/>
-          <w:sz w:val="21"/>
-        </w:rPr>
-        <w:t>Survived a real operator merger that added ~1,100 stores overnight without breaking; now on Cloudflare Pages, auto-refreshed daily via GitHub Actions.</w:t>
-      </w:r>
-    </w:p>
-    <w:p>
-      <w:pPr>
-        <w:widowControl w:val="0"/>
-        <w:tabs>
-          <w:tab w:pos="9004" w:val="right"/>
-        </w:tabs>
-        <w:spacing w:before="140" w:after="0" w:line="240" w:lineRule="auto"/>
-      </w:pPr>
-      <w:r>
-        <w:rPr>
-          <w:rFonts w:ascii="Carlito" w:hAnsi="Carlito" w:cs="Carlito" w:eastAsia="Carlito"/>
-          <w:b/>
-          <w:i w:val="0"/>
-          <w:sz w:val="22"/>
-        </w:rPr>
-        <w:t>Chrostory — Full-Stack Web App</w:t>
-      </w:r>
-      <w:r>
-        <w:rPr>
-          <w:rFonts w:ascii="Carlito" w:hAnsi="Carlito" w:cs="Carlito" w:eastAsia="Carlito"/>
-          <w:b/>
-          <w:i w:val="0"/>
-          <w:sz w:val="22"/>
-        </w:rPr>
-        <w:tab/>
-      </w:r>
-      <w:r>
-        <w:rPr>
-          <w:rFonts w:ascii="Carlito" w:hAnsi="Carlito" w:cs="Carlito" w:eastAsia="Carlito"/>
-          <w:b w:val="0"/>
-          <w:i/>
-          <w:sz w:val="20"/>
-        </w:rPr>
-        <w:t>2025 · Founder (launched &amp; sunset)</w:t>
-      </w:r>
-    </w:p>
-    <w:p>
-      <w:pPr>
-        <w:widowControl w:val="0"/>
-        <w:tabs>
-          <w:tab w:pos="340" w:val="left"/>
-        </w:tabs>
-        <w:spacing w:before="28" w:after="40" w:line="240" w:lineRule="auto"/>
-        <w:ind w:left="340" w:hanging="200"/>
-      </w:pPr>
-      <w:r>
-        <w:rPr>
-          <w:rFonts w:ascii="Carlito" w:hAnsi="Carlito" w:cs="Carlito" w:eastAsia="Carlito"/>
-          <w:b w:val="0"/>
-          <w:i w:val="0"/>
-          <w:sz w:val="21"/>
-        </w:rPr>
-        <w:t>•</w:t>
-        <w:tab/>
-      </w:r>
-      <w:r>
-        <w:rPr>
-          <w:rFonts w:ascii="Carlito" w:hAnsi="Carlito" w:cs="Carlito" w:eastAsia="Carlito"/>
-          <w:b w:val="0"/>
-          <w:i w:val="0"/>
-          <w:sz w:val="21"/>
-        </w:rPr>
-        <w:t>Took an original product from concept to public beta solo and validated it with 40+ real users; made the call to sunset it and applied the lessons — faster shipping, SEO-first architecture, automated data — directly to the two larger launches that followed.</w:t>
-      </w:r>
-    </w:p>
-    <w:p>
-      <w:pPr>
-        <w:widowControl w:val="0"/>
-        <w:tabs>
-          <w:tab w:pos="9004" w:val="right"/>
-        </w:tabs>
-        <w:spacing w:before="140" w:after="0" w:line="240" w:lineRule="auto"/>
-      </w:pPr>
-      <w:r>
-        <w:rPr>
-          <w:rFonts w:ascii="Carlito" w:hAnsi="Carlito" w:cs="Carlito" w:eastAsia="Carlito"/>
-          <w:b/>
-          <w:i w:val="0"/>
-          <w:sz w:val="22"/>
-        </w:rPr>
-        <w:t>Discord Community Platform &amp; Bots</w:t>
-      </w:r>
-      <w:r>
-        <w:rPr>
-          <w:rFonts w:ascii="Carlito" w:hAnsi="Carlito" w:cs="Carlito" w:eastAsia="Carlito"/>
-          <w:b/>
-          <w:i w:val="0"/>
-          <w:sz w:val="22"/>
-        </w:rPr>
-        <w:tab/>
-      </w:r>
-      <w:r>
-        <w:rPr>
-          <w:rFonts w:ascii="Carlito" w:hAnsi="Carlito" w:cs="Carlito" w:eastAsia="Carlito"/>
-          <w:b w:val="0"/>
-          <w:i/>
-          <w:sz w:val="20"/>
-        </w:rPr>
-        <w:t>2019 – Present</w:t>
-      </w:r>
-    </w:p>
-    <w:p>
-      <w:pPr>
-        <w:widowControl w:val="0"/>
-        <w:tabs>
-          <w:tab w:pos="340" w:val="left"/>
-        </w:tabs>
-        <w:spacing w:before="28" w:after="40" w:line="240" w:lineRule="auto"/>
-        <w:ind w:left="340" w:hanging="200"/>
-      </w:pPr>
-      <w:r>
-        <w:rPr>
-          <w:rFonts w:ascii="Carlito" w:hAnsi="Carlito" w:cs="Carlito" w:eastAsia="Carlito"/>
-          <w:b w:val="0"/>
-          <w:i w:val="0"/>
-          <w:sz w:val="21"/>
-        </w:rPr>
-        <w:t>•</w:t>
-        <w:tab/>
-      </w:r>
-      <w:r>
-        <w:rPr>
-          <w:rFonts w:ascii="Carlito" w:hAnsi="Carlito" w:cs="Carlito" w:eastAsia="Carlito"/>
-          <w:b w:val="0"/>
-          <w:i w:val="0"/>
-          <w:sz w:val="21"/>
-        </w:rPr>
-        <w:t>Grew a community from zero to 3,500+ active members; built custom Python bots with NLP features to automate moderation and support e-commerce operations.</w:t>
-      </w:r>
-    </w:p>
-    <w:p>
-      <w:pPr>
-        <w:widowControl w:val="0"/>
-        <w:tabs>
-          <w:tab w:pos="340" w:val="left"/>
-        </w:tabs>
-        <w:spacing w:before="0" w:after="40" w:line="240" w:lineRule="auto"/>
-        <w:ind w:left="340" w:hanging="200"/>
-      </w:pPr>
-      <w:r>
-        <w:rPr>
-          <w:rFonts w:ascii="Carlito" w:hAnsi="Carlito" w:cs="Carlito" w:eastAsia="Carlito"/>
-          <w:b w:val="0"/>
-          <w:i w:val="0"/>
-          <w:sz w:val="21"/>
-        </w:rPr>
-        <w:t>•</w:t>
-        <w:tab/>
-      </w:r>
-      <w:r>
-        <w:rPr>
-          <w:rFonts w:ascii="Carlito" w:hAnsi="Carlito" w:cs="Carlito" w:eastAsia="Carlito"/>
-          <w:b w:val="0"/>
-          <w:i w:val="0"/>
-          <w:sz w:val="21"/>
-        </w:rPr>
-        <w:t>Active in the KC Meshtastic (LoRa mesh networking) community — help plan node placement and RF coverage, troubleshoot member setups, and exchange design approaches with others building custom mesh networks.</w:t>
+        <w:t>Programmatically generated 185 static SEO pages with JSON-LD structured data, sitemap, and Search Console integration; live-score polling with caching and fallback states.</w:t>
       </w:r>
     </w:p>
     <w:p>
@@ -687,7 +682,7 @@
           <w:i w:val="0"/>
           <w:sz w:val="21"/>
         </w:rPr>
-        <w:t>Python (scraping, data pipelines, automation), JavaScript, SQL, HTML/CSS</w:t>
+        <w:t>Python (scraping, data pipelines, automation), SQL, JavaScript, C, HTML/CSS</w:t>
       </w:r>
     </w:p>
     <w:p>
@@ -716,7 +711,7 @@
           <w:i w:val="0"/>
           <w:sz w:val="21"/>
         </w:rPr>
-        <w:t xml:space="preserve">Web &amp; Data: </w:t>
+        <w:t xml:space="preserve">Data: </w:t>
       </w:r>
       <w:r>
         <w:rPr>
@@ -725,7 +720,45 @@
           <w:i w:val="0"/>
           <w:sz w:val="21"/>
         </w:rPr>
-        <w:t>REST APIs, API reverse-engineering, static site generation, technical SEO, Leaflet.js mapping, JSON data architecture</w:t>
+        <w:t>ETL pipelines, entity resolution, deduplication, pandas, SQLite, DuckDB, Parquet, REST APIs, API reverse-engineering, Playwright, PDF and OCR extraction (Tesseract, pdfplumber), JSON data architecture</w:t>
+      </w:r>
+    </w:p>
+    <w:p>
+      <w:pPr>
+        <w:widowControl w:val="0"/>
+        <w:tabs>
+          <w:tab w:pos="340" w:val="left"/>
+        </w:tabs>
+        <w:spacing w:before="0" w:after="40" w:line="240" w:lineRule="auto"/>
+        <w:ind w:left="340" w:hanging="200"/>
+      </w:pPr>
+      <w:r>
+        <w:rPr>
+          <w:rFonts w:ascii="Carlito" w:hAnsi="Carlito" w:cs="Carlito" w:eastAsia="Carlito"/>
+          <w:b w:val="0"/>
+          <w:i w:val="0"/>
+          <w:sz w:val="21"/>
+        </w:rPr>
+        <w:t>•</w:t>
+        <w:tab/>
+      </w:r>
+      <w:r>
+        <w:rPr>
+          <w:rFonts w:ascii="Carlito" w:hAnsi="Carlito" w:cs="Carlito" w:eastAsia="Carlito"/>
+          <w:b/>
+          <w:i w:val="0"/>
+          <w:sz w:val="21"/>
+        </w:rPr>
+        <w:t xml:space="preserve">Testing &amp; Reliability: </w:t>
+      </w:r>
+      <w:r>
+        <w:rPr>
+          <w:rFonts w:ascii="Carlito" w:hAnsi="Carlito" w:cs="Carlito" w:eastAsia="Carlito"/>
+          <w:b w:val="0"/>
+          <w:i w:val="0"/>
+          <w:sz w:val="21"/>
+        </w:rPr>
+        <w:t>pytest, fixture-based contract tests, negative controls, coverage reporting, pre-registered thresholds, failure detection and alerting</w:t>
       </w:r>
     </w:p>
     <w:p>
@@ -763,7 +796,7 @@
           <w:i w:val="0"/>
           <w:sz w:val="21"/>
         </w:rPr>
-        <w:t>Git/GitHub, CI/CD (Cloudflare Pages, Netlify), Windows task automation, scheduled data refresh systems</w:t>
+        <w:t>Git/GitHub, CI/CD (GitHub Actions, Cloudflare Pages, Netlify), scheduled jobs, robots.txt and rate-limit compliance</w:t>
       </w:r>
     </w:p>
     <w:p>
@@ -831,7 +864,7 @@
           <w:i w:val="0"/>
           <w:sz w:val="21"/>
         </w:rPr>
-        <w:t>10+ years of front-line operations and team leadership — including founding and operating my own business — managing teams of up to 100 people across high-volume service environments, staffing, and vendor coordination.</w:t>
+        <w:t>Front-line operations and team leadership — including founding and operating my own business — managing teams of up to 100 people across high-volume service environments, staffing, and vendor coordination.</w:t>
       </w:r>
     </w:p>
     <w:p>
@@ -897,6 +930,35 @@
           <w:sz w:val="21"/>
         </w:rPr>
         <w:t>Build and ship production scrapers, data pipelines, and automation — turning messy public and web data sources into clean, scheduled, queryable datasets and dashboards (see shipped projects above).</w:t>
+      </w:r>
+    </w:p>
+    <w:p>
+      <w:pPr>
+        <w:widowControl w:val="0"/>
+        <w:tabs>
+          <w:tab w:pos="340" w:val="left"/>
+        </w:tabs>
+        <w:spacing w:before="0" w:after="40" w:line="240" w:lineRule="auto"/>
+        <w:ind w:left="340" w:hanging="200"/>
+      </w:pPr>
+      <w:r>
+        <w:rPr>
+          <w:rFonts w:ascii="Carlito" w:hAnsi="Carlito" w:cs="Carlito" w:eastAsia="Carlito"/>
+          <w:b w:val="0"/>
+          <w:i w:val="0"/>
+          <w:sz w:val="21"/>
+        </w:rPr>
+        <w:t>•</w:t>
+        <w:tab/>
+      </w:r>
+      <w:r>
+        <w:rPr>
+          <w:rFonts w:ascii="Carlito" w:hAnsi="Carlito" w:cs="Carlito" w:eastAsia="Carlito"/>
+          <w:b w:val="0"/>
+          <w:i w:val="0"/>
+          <w:sz w:val="21"/>
+        </w:rPr>
+        <w:t>Contract work delivered across records consolidation and data visualization; 100% Job Success Score and Rising Talent status on Upwork as of September 2026.</w:t>
       </w:r>
     </w:p>
     <w:p>
@@ -991,71 +1053,6 @@
           <w:sz w:val="21"/>
         </w:rPr>
         <w:t>Coordinated daily across five constituencies (county sheriff, school principals, parents, the district, and the guards) and solved same-day coverage through a deep bench of on-call relationships — every student returned home safely, zero students injured across my full tenure.</w:t>
-      </w:r>
-    </w:p>
-    <w:p>
-      <w:pPr>
-        <w:widowControl w:val="0"/>
-        <w:tabs>
-          <w:tab w:pos="9004" w:val="right"/>
-        </w:tabs>
-        <w:spacing w:before="140" w:after="0" w:line="240" w:lineRule="auto"/>
-      </w:pPr>
-      <w:r>
-        <w:rPr>
-          <w:rFonts w:ascii="Carlito" w:hAnsi="Carlito" w:cs="Carlito" w:eastAsia="Carlito"/>
-          <w:b/>
-          <w:i w:val="0"/>
-          <w:sz w:val="22"/>
-        </w:rPr>
-        <w:t>Bartender — Tabard's Kitchen</w:t>
-      </w:r>
-      <w:r>
-        <w:rPr>
-          <w:rFonts w:ascii="Carlito" w:hAnsi="Carlito" w:cs="Carlito" w:eastAsia="Carlito"/>
-          <w:b/>
-          <w:i w:val="0"/>
-          <w:sz w:val="22"/>
-        </w:rPr>
-        <w:tab/>
-      </w:r>
-      <w:r>
-        <w:rPr>
-          <w:rFonts w:ascii="Carlito" w:hAnsi="Carlito" w:cs="Carlito" w:eastAsia="Carlito"/>
-          <w:b w:val="0"/>
-          <w:i/>
-          <w:sz w:val="20"/>
-        </w:rPr>
-        <w:t>2019 – 2020</w:t>
-      </w:r>
-    </w:p>
-    <w:p>
-      <w:pPr>
-        <w:widowControl w:val="0"/>
-        <w:tabs>
-          <w:tab w:pos="340" w:val="left"/>
-        </w:tabs>
-        <w:spacing w:before="28" w:after="40" w:line="240" w:lineRule="auto"/>
-        <w:ind w:left="340" w:hanging="200"/>
-      </w:pPr>
-      <w:r>
-        <w:rPr>
-          <w:rFonts w:ascii="Carlito" w:hAnsi="Carlito" w:cs="Carlito" w:eastAsia="Carlito"/>
-          <w:b w:val="0"/>
-          <w:i w:val="0"/>
-          <w:sz w:val="21"/>
-        </w:rPr>
-        <w:t>•</w:t>
-        <w:tab/>
-      </w:r>
-      <w:r>
-        <w:rPr>
-          <w:rFonts w:ascii="Carlito" w:hAnsi="Carlito" w:cs="Carlito" w:eastAsia="Carlito"/>
-          <w:b w:val="0"/>
-          <w:i w:val="0"/>
-          <w:sz w:val="21"/>
-        </w:rPr>
-        <w:t>Ran the full lunch service solo as the only front-of-house staff — bartending, serving, taking and firing orders, running payments, and holding food-safety standards through the rush.</w:t>
       </w:r>
     </w:p>
     <w:p>

</xml_diff>